<commit_message>
Edit spacing on Atwood article. Also, delete the lock file that was created by mistake.
</commit_message>
<xml_diff>
--- a/articles-p-byrne/README How to add a new Peter Byrne Article.docx
+++ b/articles-p-byrne/README How to add a new Peter Byrne Article.docx
@@ -1879,11 +1879,7 @@
       </w:pPr>
       <w:r>
         <w:rPr/>
-        <w:t xml:space="preserve">jim-and-james-on-the-big muddy – </w:t>
-      </w:r>
-      <w:r>
-        <w:rPr/>
-        <w:t>also video</w:t>
+        <w:t>jim-and-james-on-the-big muddy – also video</w:t>
       </w:r>
     </w:p>
     <w:p>
@@ -2425,8 +2421,8 @@
       <w:bCs/>
     </w:rPr>
   </w:style>
-  <w:style w:type="character" w:styleId="Bullets">
-    <w:name w:val="Bullets"/>
+  <w:style w:type="character" w:styleId="Bulletsuser">
+    <w:name w:val="Bullets (user)"/>
     <w:qFormat/>
     <w:rPr>
       <w:rFonts w:ascii="OpenSymbol" w:hAnsi="OpenSymbol" w:eastAsia="OpenSymbol" w:cs="OpenSymbol"/>
@@ -2508,37 +2504,37 @@
         <a:srgbClr val="000000"/>
       </a:dk1>
       <a:lt1>
-        <a:srgbClr val="ffffff"/>
+        <a:srgbClr val="FFFFFF"/>
       </a:lt1>
       <a:dk2>
         <a:srgbClr val="000000"/>
       </a:dk2>
       <a:lt2>
-        <a:srgbClr val="ffffff"/>
+        <a:srgbClr val="FFFFFF"/>
       </a:lt2>
       <a:accent1>
-        <a:srgbClr val="18a303"/>
+        <a:srgbClr val="18A303"/>
       </a:accent1>
       <a:accent2>
-        <a:srgbClr val="0369a3"/>
+        <a:srgbClr val="0369A3"/>
       </a:accent2>
       <a:accent3>
-        <a:srgbClr val="a33e03"/>
+        <a:srgbClr val="A33E03"/>
       </a:accent3>
       <a:accent4>
-        <a:srgbClr val="8e03a3"/>
+        <a:srgbClr val="8E03A3"/>
       </a:accent4>
       <a:accent5>
-        <a:srgbClr val="c99c00"/>
+        <a:srgbClr val="C99C00"/>
       </a:accent5>
       <a:accent6>
-        <a:srgbClr val="c9211e"/>
+        <a:srgbClr val="C9211E"/>
       </a:accent6>
       <a:hlink>
-        <a:srgbClr val="0000ee"/>
+        <a:srgbClr val="0000EE"/>
       </a:hlink>
       <a:folHlink>
-        <a:srgbClr val="551a8b"/>
+        <a:srgbClr val="551A8B"/>
       </a:folHlink>
     </a:clrScheme>
     <a:fontScheme name="Office">

</xml_diff>

<commit_message>
Add Saunders Book review and book reviews folder, and make more small formatting changes.
</commit_message>
<xml_diff>
--- a/articles-p-byrne/README How to add a new Peter Byrne Article.docx
+++ b/articles-p-byrne/README How to add a new Peter Byrne Article.docx
@@ -1928,6 +1928,104 @@
       </w:pPr>
       <w:r>
         <w:rPr/>
+      </w:r>
+    </w:p>
+    <w:p>
+      <w:pPr>
+        <w:pStyle w:val="Normal"/>
+        <w:bidi w:val="0"/>
+        <w:jc w:val="start"/>
+        <w:rPr/>
+      </w:pPr>
+      <w:r>
+        <w:rPr/>
+      </w:r>
+    </w:p>
+    <w:p>
+      <w:pPr>
+        <w:pStyle w:val="Normal"/>
+        <w:bidi w:val="0"/>
+        <w:jc w:val="start"/>
+        <w:rPr/>
+      </w:pPr>
+      <w:r>
+        <w:rPr/>
+      </w:r>
+    </w:p>
+    <w:p>
+      <w:pPr>
+        <w:pStyle w:val="Normal"/>
+        <w:bidi w:val="0"/>
+        <w:jc w:val="start"/>
+        <w:rPr>
+          <w:u w:val="single"/>
+        </w:rPr>
+      </w:pPr>
+      <w:r>
+        <w:rPr>
+          <w:u w:val="single"/>
+        </w:rPr>
+        <w:t>Important Points in the CSS files</w:t>
+      </w:r>
+    </w:p>
+    <w:p>
+      <w:pPr>
+        <w:pStyle w:val="Normal"/>
+        <w:bidi w:val="0"/>
+        <w:jc w:val="start"/>
+        <w:rPr/>
+      </w:pPr>
+      <w:r>
+        <w:rPr/>
+        <w:t>Index (Home Page) banner specifications</w:t>
+      </w:r>
+    </w:p>
+    <w:p>
+      <w:pPr>
+        <w:pStyle w:val="Normal"/>
+        <w:bidi w:val="0"/>
+        <w:jc w:val="start"/>
+        <w:rPr/>
+      </w:pPr>
+      <w:r>
+        <w:rPr/>
+        <w:tab/>
+        <w:t>Components CSS – for mobiles – lines 42 and 62</w:t>
+      </w:r>
+    </w:p>
+    <w:p>
+      <w:pPr>
+        <w:pStyle w:val="Normal"/>
+        <w:bidi w:val="0"/>
+        <w:jc w:val="start"/>
+        <w:rPr/>
+      </w:pPr>
+      <w:r>
+        <w:rPr/>
+      </w:r>
+    </w:p>
+    <w:p>
+      <w:pPr>
+        <w:pStyle w:val="Normal"/>
+        <w:bidi w:val="0"/>
+        <w:jc w:val="start"/>
+        <w:rPr/>
+      </w:pPr>
+      <w:r>
+        <w:rPr/>
+        <w:t>Title Text in Headers</w:t>
+      </w:r>
+    </w:p>
+    <w:p>
+      <w:pPr>
+        <w:pStyle w:val="Normal"/>
+        <w:bidi w:val="0"/>
+        <w:jc w:val="start"/>
+        <w:rPr/>
+      </w:pPr>
+      <w:r>
+        <w:rPr/>
+        <w:tab/>
       </w:r>
     </w:p>
     <w:p>
@@ -2421,8 +2519,8 @@
       <w:bCs/>
     </w:rPr>
   </w:style>
-  <w:style w:type="character" w:styleId="Bulletsuser">
-    <w:name w:val="Bullets (user)"/>
+  <w:style w:type="character" w:styleId="Bullets">
+    <w:name w:val="Bullets"/>
     <w:qFormat/>
     <w:rPr>
       <w:rFonts w:ascii="OpenSymbol" w:hAnsi="OpenSymbol" w:eastAsia="OpenSymbol" w:cs="OpenSymbol"/>

</xml_diff>